<commit_message>
Regenerate alignment data for 2026-09-18 release
</commit_message>
<xml_diff>
--- a/eng/docx/004.content.docx
+++ b/eng/docx/004.content.docx
@@ -353,18 +353,12 @@
         </w:rPr>
         <w:t xml:space="preserve">: </w:t>
       </w:r>
-      <w:hyperlink r:id="rId13">
-        <w:r>
-          <w:rPr>
-            <w:lang w:val="en_US" w:bidi="en_US"/>
-          </w:rPr>
-          <w:rPr>
-            <w:color w:val="0000EE"/>
-            <w:u w:val="single"/>
-          </w:rPr>
-          <w:t>Dn 4:34</w:t>
-        </w:r>
-      </w:hyperlink>
+      <w:r>
+        <w:rPr>
+          <w:lang w:val="en_US" w:bidi="en_US"/>
+        </w:rPr>
+        <w:t>Dn 4:34</w:t>
+      </w:r>
       <w:r>
         <w:rPr>
           <w:lang w:val="en_US" w:bidi="en_US"/>
@@ -594,18 +588,12 @@
         </w:rPr>
         <w:t xml:space="preserve"> sf. </w:t>
       </w:r>
-      <w:hyperlink r:id="rId14">
-        <w:r>
-          <w:rPr>
-            <w:lang w:val="en_US" w:bidi="en_US"/>
-          </w:rPr>
-          <w:rPr>
-            <w:color w:val="0000EE"/>
-            <w:u w:val="single"/>
-          </w:rPr>
-          <w:t>Dn 7:6</w:t>
-        </w:r>
-      </w:hyperlink>
+      <w:r>
+        <w:rPr>
+          <w:lang w:val="en_US" w:bidi="en_US"/>
+        </w:rPr>
+        <w:t>Dn 7:6</w:t>
+      </w:r>
       <w:r>
         <w:rPr>
           <w:lang w:val="en_US" w:bidi="en_US"/>
@@ -870,36 +858,24 @@
         </w:rPr>
         <w:t xml:space="preserve">: </w:t>
       </w:r>
-      <w:hyperlink r:id="rId15">
-        <w:r>
-          <w:rPr>
-            <w:lang w:val="en_US" w:bidi="en_US"/>
-          </w:rPr>
-          <w:rPr>
-            <w:color w:val="0000EE"/>
-            <w:u w:val="single"/>
-          </w:rPr>
-          <w:t>Dn 6:8</w:t>
-        </w:r>
-      </w:hyperlink>
+      <w:r>
+        <w:rPr>
+          <w:lang w:val="en_US" w:bidi="en_US"/>
+        </w:rPr>
+        <w:t>Dn 6:8</w:t>
+      </w:r>
       <w:r>
         <w:rPr>
           <w:lang w:val="en_US" w:bidi="en_US"/>
         </w:rPr>
         <w:t xml:space="preserve">, </w:t>
       </w:r>
-      <w:hyperlink r:id="rId16">
-        <w:r>
-          <w:rPr>
-            <w:lang w:val="en_US" w:bidi="en_US"/>
-          </w:rPr>
-          <w:rPr>
-            <w:color w:val="0000EE"/>
-            <w:u w:val="single"/>
-          </w:rPr>
-          <w:t>6:25</w:t>
-        </w:r>
-      </w:hyperlink>
+      <w:r>
+        <w:rPr>
+          <w:lang w:val="en_US" w:bidi="en_US"/>
+        </w:rPr>
+        <w:t>6:25</w:t>
+      </w:r>
       <w:r>
         <w:rPr>
           <w:lang w:val="en_US" w:bidi="en_US"/>
@@ -918,18 +894,12 @@
         </w:rPr>
         <w:t xml:space="preserve"> v:</w:t>
       </w:r>
-      <w:hyperlink r:id="rId17">
-        <w:r>
-          <w:rPr>
-            <w:lang w:val="en_US" w:bidi="en_US"/>
-          </w:rPr>
-          <w:rPr>
-            <w:color w:val="0000EE"/>
-            <w:u w:val="single"/>
-          </w:rPr>
-          <w:t>13</w:t>
-        </w:r>
-      </w:hyperlink>
+      <w:r>
+        <w:rPr>
+          <w:lang w:val="en_US" w:bidi="en_US"/>
+        </w:rPr>
+        <w:t>13</w:t>
+      </w:r>
       <w:r>
         <w:rPr>
           <w:lang w:val="en_US" w:bidi="en_US"/>
@@ -948,126 +918,84 @@
         </w:rPr>
         <w:t xml:space="preserve"> v:</w:t>
       </w:r>
-      <w:hyperlink r:id="rId18">
-        <w:r>
-          <w:rPr>
-            <w:lang w:val="en_US" w:bidi="en_US"/>
-          </w:rPr>
-          <w:rPr>
-            <w:color w:val="0000EE"/>
-            <w:u w:val="single"/>
-          </w:rPr>
-          <w:t>17</w:t>
-        </w:r>
-      </w:hyperlink>
+      <w:r>
+        <w:rPr>
+          <w:lang w:val="en_US" w:bidi="en_US"/>
+        </w:rPr>
+        <w:t>17</w:t>
+      </w:r>
       <w:r>
         <w:rPr>
           <w:lang w:val="en_US" w:bidi="en_US"/>
         </w:rPr>
         <w:t>, v:</w:t>
       </w:r>
-      <w:hyperlink r:id="rId19">
-        <w:r>
-          <w:rPr>
-            <w:lang w:val="en_US" w:bidi="en_US"/>
-          </w:rPr>
-          <w:rPr>
-            <w:color w:val="0000EE"/>
-            <w:u w:val="single"/>
-          </w:rPr>
-          <w:t>18</w:t>
-        </w:r>
-      </w:hyperlink>
+      <w:r>
+        <w:rPr>
+          <w:lang w:val="en_US" w:bidi="en_US"/>
+        </w:rPr>
+        <w:t>18</w:t>
+      </w:r>
       <w:r>
         <w:rPr>
           <w:lang w:val="en_US" w:bidi="en_US"/>
         </w:rPr>
         <w:t>, v:</w:t>
       </w:r>
-      <w:hyperlink r:id="rId20">
-        <w:r>
-          <w:rPr>
-            <w:lang w:val="en_US" w:bidi="en_US"/>
-          </w:rPr>
-          <w:rPr>
-            <w:color w:val="0000EE"/>
-            <w:u w:val="single"/>
-          </w:rPr>
-          <w:t>20</w:t>
-        </w:r>
-      </w:hyperlink>
+      <w:r>
+        <w:rPr>
+          <w:lang w:val="en_US" w:bidi="en_US"/>
+        </w:rPr>
+        <w:t>20</w:t>
+      </w:r>
       <w:r>
         <w:rPr>
           <w:lang w:val="en_US" w:bidi="en_US"/>
         </w:rPr>
         <w:t>, v:</w:t>
       </w:r>
-      <w:hyperlink r:id="rId21">
-        <w:r>
-          <w:rPr>
-            <w:lang w:val="en_US" w:bidi="en_US"/>
-          </w:rPr>
-          <w:rPr>
-            <w:color w:val="0000EE"/>
-            <w:u w:val="single"/>
-          </w:rPr>
-          <w:t>21</w:t>
-        </w:r>
-      </w:hyperlink>
+      <w:r>
+        <w:rPr>
+          <w:lang w:val="en_US" w:bidi="en_US"/>
+        </w:rPr>
+        <w:t>21</w:t>
+      </w:r>
       <w:r>
         <w:rPr>
           <w:lang w:val="en_US" w:bidi="en_US"/>
         </w:rPr>
         <w:t>, v:</w:t>
       </w:r>
-      <w:hyperlink r:id="rId22">
-        <w:r>
-          <w:rPr>
-            <w:lang w:val="en_US" w:bidi="en_US"/>
-          </w:rPr>
-          <w:rPr>
-            <w:color w:val="0000EE"/>
-            <w:u w:val="single"/>
-          </w:rPr>
-          <w:t>24</w:t>
-        </w:r>
-      </w:hyperlink>
+      <w:r>
+        <w:rPr>
+          <w:lang w:val="en_US" w:bidi="en_US"/>
+        </w:rPr>
+        <w:t>24</w:t>
+      </w:r>
       <w:r>
         <w:rPr>
           <w:lang w:val="en_US" w:bidi="en_US"/>
         </w:rPr>
         <w:t>, v:</w:t>
       </w:r>
-      <w:hyperlink r:id="rId22">
-        <w:r>
-          <w:rPr>
-            <w:lang w:val="en_US" w:bidi="en_US"/>
-          </w:rPr>
-          <w:rPr>
-            <w:color w:val="0000EE"/>
-            <w:u w:val="single"/>
-          </w:rPr>
-          <w:t>24</w:t>
-        </w:r>
-      </w:hyperlink>
+      <w:r>
+        <w:rPr>
+          <w:lang w:val="en_US" w:bidi="en_US"/>
+        </w:rPr>
+        <w:t>24</w:t>
+      </w:r>
       <w:r>
         <w:rPr>
           <w:lang w:val="en_US" w:bidi="en_US"/>
         </w:rPr>
         <w:t>, v:</w:t>
       </w:r>
-      <w:hyperlink r:id="rId16">
-        <w:r>
-          <w:rPr>
-            <w:lang w:val="en_US" w:bidi="en_US"/>
-          </w:rPr>
-          <w:rPr>
-            <w:color w:val="0000EE"/>
-            <w:u w:val="single"/>
-          </w:rPr>
-          <w:t>25</w:t>
-        </w:r>
-      </w:hyperlink>
+      <w:r>
+        <w:rPr>
+          <w:lang w:val="en_US" w:bidi="en_US"/>
+        </w:rPr>
+        <w:t>25</w:t>
+      </w:r>
       <w:r>
         <w:rPr>
           <w:lang w:val="en_US" w:bidi="en_US"/>
@@ -1252,36 +1180,24 @@
         </w:rPr>
         <w:t xml:space="preserve">: </w:t>
       </w:r>
-      <w:hyperlink r:id="rId23">
-        <w:r>
-          <w:rPr>
-            <w:lang w:val="en_US" w:bidi="en_US"/>
-          </w:rPr>
-          <w:rPr>
-            <w:color w:val="0000EE"/>
-            <w:u w:val="single"/>
-          </w:rPr>
-          <w:t>Dn 2:25</w:t>
-        </w:r>
-      </w:hyperlink>
+      <w:r>
+        <w:rPr>
+          <w:lang w:val="en_US" w:bidi="en_US"/>
+        </w:rPr>
+        <w:t>Dn 2:25</w:t>
+      </w:r>
       <w:r>
         <w:rPr>
           <w:lang w:val="en_US" w:bidi="en_US"/>
         </w:rPr>
         <w:t xml:space="preserve"> </w:t>
       </w:r>
-      <w:hyperlink r:id="rId24">
-        <w:r>
-          <w:rPr>
-            <w:lang w:val="en_US" w:bidi="en_US"/>
-          </w:rPr>
-          <w:rPr>
-            <w:color w:val="0000EE"/>
-            <w:u w:val="single"/>
-          </w:rPr>
-          <w:t>5:11</w:t>
-        </w:r>
-      </w:hyperlink>
+      <w:r>
+        <w:rPr>
+          <w:lang w:val="en_US" w:bidi="en_US"/>
+        </w:rPr>
+        <w:t>5:11</w:t>
+      </w:r>
       <w:r>
         <w:rPr>
           <w:lang w:val="en_US" w:bidi="en_US"/>
@@ -1331,36 +1247,24 @@
         </w:rPr>
         <w:t xml:space="preserve"> 54, 3 e) </w:t>
       </w:r>
-      <w:hyperlink r:id="rId25">
-        <w:r>
-          <w:rPr>
-            <w:lang w:val="en_US" w:bidi="en_US"/>
-          </w:rPr>
-          <w:rPr>
-            <w:color w:val="0000EE"/>
-            <w:u w:val="single"/>
-          </w:rPr>
-          <w:t>3:24</w:t>
-        </w:r>
-      </w:hyperlink>
+      <w:r>
+        <w:rPr>
+          <w:lang w:val="en_US" w:bidi="en_US"/>
+        </w:rPr>
+        <w:t>3:24</w:t>
+      </w:r>
       <w:r>
         <w:rPr>
           <w:lang w:val="en_US" w:bidi="en_US"/>
         </w:rPr>
         <w:t xml:space="preserve">, </w:t>
       </w:r>
-      <w:hyperlink r:id="rId26">
-        <w:r>
-          <w:rPr>
-            <w:lang w:val="en_US" w:bidi="en_US"/>
-          </w:rPr>
-          <w:rPr>
-            <w:color w:val="0000EE"/>
-            <w:u w:val="single"/>
-          </w:rPr>
-          <w:t>3:25</w:t>
-        </w:r>
-      </w:hyperlink>
+      <w:r>
+        <w:rPr>
+          <w:lang w:val="en_US" w:bidi="en_US"/>
+        </w:rPr>
+        <w:t>3:25</w:t>
+      </w:r>
       <w:r>
         <w:rPr>
           <w:lang w:val="en_US" w:bidi="en_US"/>
@@ -1380,54 +1284,36 @@
         </w:rPr>
         <w:t xml:space="preserve"> ones, v:</w:t>
       </w:r>
-      <w:hyperlink r:id="rId27">
-        <w:r>
-          <w:rPr>
-            <w:lang w:val="en_US" w:bidi="en_US"/>
-          </w:rPr>
-          <w:rPr>
-            <w:color w:val="0000EE"/>
-            <w:u w:val="single"/>
-          </w:rPr>
-          <w:t>8</w:t>
-        </w:r>
-      </w:hyperlink>
+      <w:r>
+        <w:rPr>
+          <w:lang w:val="en_US" w:bidi="en_US"/>
+        </w:rPr>
+        <w:t>8</w:t>
+      </w:r>
       <w:r>
         <w:rPr>
           <w:lang w:val="en_US" w:bidi="en_US"/>
         </w:rPr>
         <w:t>, v:</w:t>
       </w:r>
-      <w:hyperlink r:id="rId28">
-        <w:r>
-          <w:rPr>
-            <w:lang w:val="en_US" w:bidi="en_US"/>
-          </w:rPr>
-          <w:rPr>
-            <w:color w:val="0000EE"/>
-            <w:u w:val="single"/>
-          </w:rPr>
-          <w:t>12</w:t>
-        </w:r>
-      </w:hyperlink>
+      <w:r>
+        <w:rPr>
+          <w:lang w:val="en_US" w:bidi="en_US"/>
+        </w:rPr>
+        <w:t>12</w:t>
+      </w:r>
       <w:r>
         <w:rPr>
           <w:lang w:val="en_US" w:bidi="en_US"/>
         </w:rPr>
         <w:t>, v:</w:t>
       </w:r>
-      <w:hyperlink r:id="rId29">
-        <w:r>
-          <w:rPr>
-            <w:lang w:val="en_US" w:bidi="en_US"/>
-          </w:rPr>
-          <w:rPr>
-            <w:color w:val="0000EE"/>
-            <w:u w:val="single"/>
-          </w:rPr>
-          <w:t>20</w:t>
-        </w:r>
-      </w:hyperlink>
+      <w:r>
+        <w:rPr>
+          <w:lang w:val="en_US" w:bidi="en_US"/>
+        </w:rPr>
+        <w:t>20</w:t>
+      </w:r>
       <w:r>
         <w:rPr>
           <w:lang w:val="en_US" w:bidi="en_US"/>
@@ -1446,90 +1332,60 @@
         </w:rPr>
         <w:t xml:space="preserve"> </w:t>
       </w:r>
-      <w:hyperlink r:id="rId30">
-        <w:r>
-          <w:rPr>
-            <w:lang w:val="en_US" w:bidi="en_US"/>
-          </w:rPr>
-          <w:rPr>
-            <w:color w:val="0000EE"/>
-            <w:u w:val="single"/>
-          </w:rPr>
-          <w:t>Ezr 4:21</w:t>
-        </w:r>
-      </w:hyperlink>
+      <w:r>
+        <w:rPr>
+          <w:lang w:val="en_US" w:bidi="en_US"/>
+        </w:rPr>
+        <w:t>Ezr 4:21</w:t>
+      </w:r>
       <w:r>
         <w:rPr>
           <w:lang w:val="en_US" w:bidi="en_US"/>
         </w:rPr>
         <w:t xml:space="preserve">, </w:t>
       </w:r>
-      <w:hyperlink r:id="rId31">
-        <w:r>
-          <w:rPr>
-            <w:lang w:val="en_US" w:bidi="en_US"/>
-          </w:rPr>
-          <w:rPr>
-            <w:color w:val="0000EE"/>
-            <w:u w:val="single"/>
-          </w:rPr>
-          <w:t>5:4</w:t>
-        </w:r>
-      </w:hyperlink>
+      <w:r>
+        <w:rPr>
+          <w:lang w:val="en_US" w:bidi="en_US"/>
+        </w:rPr>
+        <w:t>5:4</w:t>
+      </w:r>
       <w:r>
         <w:rPr>
           <w:lang w:val="en_US" w:bidi="en_US"/>
         </w:rPr>
         <w:t xml:space="preserve">, </w:t>
       </w:r>
-      <w:hyperlink r:id="rId32">
-        <w:r>
-          <w:rPr>
-            <w:lang w:val="en_US" w:bidi="en_US"/>
-          </w:rPr>
-          <w:rPr>
-            <w:color w:val="0000EE"/>
-            <w:u w:val="single"/>
-          </w:rPr>
-          <w:t>5:10</w:t>
-        </w:r>
-      </w:hyperlink>
+      <w:r>
+        <w:rPr>
+          <w:lang w:val="en_US" w:bidi="en_US"/>
+        </w:rPr>
+        <w:t>5:10</w:t>
+      </w:r>
       <w:r>
         <w:rPr>
           <w:lang w:val="en_US" w:bidi="en_US"/>
         </w:rPr>
         <w:t xml:space="preserve">, </w:t>
       </w:r>
-      <w:hyperlink r:id="rId33">
-        <w:r>
-          <w:rPr>
-            <w:lang w:val="en_US" w:bidi="en_US"/>
-          </w:rPr>
-          <w:rPr>
-            <w:color w:val="0000EE"/>
-            <w:u w:val="single"/>
-          </w:rPr>
-          <w:t>6:8</w:t>
-        </w:r>
-      </w:hyperlink>
+      <w:r>
+        <w:rPr>
+          <w:lang w:val="en_US" w:bidi="en_US"/>
+        </w:rPr>
+        <w:t>6:8</w:t>
+      </w:r>
       <w:r>
         <w:rPr>
           <w:lang w:val="en_US" w:bidi="en_US"/>
         </w:rPr>
         <w:t xml:space="preserve">, </w:t>
       </w:r>
-      <w:hyperlink r:id="rId28">
-        <w:r>
-          <w:rPr>
-            <w:lang w:val="en_US" w:bidi="en_US"/>
-          </w:rPr>
-          <w:rPr>
-            <w:color w:val="0000EE"/>
-            <w:u w:val="single"/>
-          </w:rPr>
-          <w:t>Dn 3:12</w:t>
-        </w:r>
-      </w:hyperlink>
+      <w:r>
+        <w:rPr>
+          <w:lang w:val="en_US" w:bidi="en_US"/>
+        </w:rPr>
+        <w:t>Dn 3:12</w:t>
+      </w:r>
       <w:r>
         <w:rPr>
           <w:lang w:val="en_US" w:bidi="en_US"/>
@@ -1649,36 +1505,24 @@
         </w:rPr>
         <w:t xml:space="preserve"> 72 c) </w:t>
       </w:r>
-      <w:hyperlink r:id="rId34">
-        <w:r>
-          <w:rPr>
-            <w:lang w:val="en_US" w:bidi="en_US"/>
-          </w:rPr>
-          <w:rPr>
-            <w:color w:val="0000EE"/>
-            <w:u w:val="single"/>
-          </w:rPr>
-          <w:t>Dn 2:20</w:t>
-        </w:r>
-      </w:hyperlink>
+      <w:r>
+        <w:rPr>
+          <w:lang w:val="en_US" w:bidi="en_US"/>
+        </w:rPr>
+        <w:t>Dn 2:20</w:t>
+      </w:r>
       <w:r>
         <w:rPr>
           <w:lang w:val="en_US" w:bidi="en_US"/>
         </w:rPr>
         <w:t xml:space="preserve">, </w:t>
       </w:r>
-      <w:hyperlink r:id="rId35">
-        <w:r>
-          <w:rPr>
-            <w:lang w:val="en_US" w:bidi="en_US"/>
-          </w:rPr>
-          <w:rPr>
-            <w:color w:val="0000EE"/>
-            <w:u w:val="single"/>
-          </w:rPr>
-          <w:t>2:23</w:t>
-        </w:r>
-      </w:hyperlink>
+      <w:r>
+        <w:rPr>
+          <w:lang w:val="en_US" w:bidi="en_US"/>
+        </w:rPr>
+        <w:t>2:23</w:t>
+      </w:r>
       <w:r>
         <w:rPr>
           <w:lang w:val="en_US" w:bidi="en_US"/>
@@ -1772,18 +1616,12 @@
         </w:rPr>
         <w:t xml:space="preserve"> </w:t>
       </w:r>
-      <w:hyperlink r:id="rId29">
-        <w:r>
-          <w:rPr>
-            <w:lang w:val="en_US" w:bidi="en_US"/>
-          </w:rPr>
-          <w:rPr>
-            <w:color w:val="0000EE"/>
-            <w:u w:val="single"/>
-          </w:rPr>
-          <w:t>Dn 3:20</w:t>
-        </w:r>
-      </w:hyperlink>
+      <w:r>
+        <w:rPr>
+          <w:lang w:val="en_US" w:bidi="en_US"/>
+        </w:rPr>
+        <w:t>Dn 3:20</w:t>
+      </w:r>
       <w:r>
         <w:rPr>
           <w:lang w:val="en_US" w:bidi="en_US"/>
@@ -1879,36 +1717,24 @@
         </w:rPr>
         <w:t xml:space="preserve"> </w:t>
       </w:r>
-      <w:hyperlink r:id="rId36">
-        <w:r>
-          <w:rPr>
-            <w:lang w:val="en_US" w:bidi="en_US"/>
-          </w:rPr>
-          <w:rPr>
-            <w:color w:val="0000EE"/>
-            <w:u w:val="single"/>
-          </w:rPr>
-          <w:t>Dn 3:2</w:t>
-        </w:r>
-      </w:hyperlink>
+      <w:r>
+        <w:rPr>
+          <w:lang w:val="en_US" w:bidi="en_US"/>
+        </w:rPr>
+        <w:t>Dn 3:2</w:t>
+      </w:r>
       <w:r>
         <w:rPr>
           <w:lang w:val="en_US" w:bidi="en_US"/>
         </w:rPr>
         <w:t xml:space="preserve">, </w:t>
       </w:r>
-      <w:hyperlink r:id="rId37">
-        <w:r>
-          <w:rPr>
-            <w:lang w:val="en_US" w:bidi="en_US"/>
-          </w:rPr>
-          <w:rPr>
-            <w:color w:val="0000EE"/>
-            <w:u w:val="single"/>
-          </w:rPr>
-          <w:t>3:3</w:t>
-        </w:r>
-      </w:hyperlink>
+      <w:r>
+        <w:rPr>
+          <w:lang w:val="en_US" w:bidi="en_US"/>
+        </w:rPr>
+        <w:t>3:3</w:t>
+      </w:r>
       <w:r>
         <w:rPr>
           <w:lang w:val="en_US" w:bidi="en_US"/>
@@ -2044,18 +1870,12 @@
         </w:rPr>
         <w:t xml:space="preserve"> (</w:t>
       </w:r>
-      <w:hyperlink r:id="rId25">
-        <w:r>
-          <w:rPr>
-            <w:lang w:val="en_US" w:bidi="en_US"/>
-          </w:rPr>
-          <w:rPr>
-            <w:color w:val="0000EE"/>
-            <w:u w:val="single"/>
-          </w:rPr>
-          <w:t>3:24</w:t>
-        </w:r>
-      </w:hyperlink>
+      <w:r>
+        <w:rPr>
+          <w:lang w:val="en_US" w:bidi="en_US"/>
+        </w:rPr>
+        <w:t>3:24</w:t>
+      </w:r>
       <w:r>
         <w:rPr>
           <w:lang w:val="en_US" w:bidi="en_US"/>
@@ -2340,36 +2160,24 @@
         </w:rPr>
         <w:t xml:space="preserve">. 94) </w:t>
       </w:r>
-      <w:hyperlink r:id="rId38">
-        <w:r>
-          <w:rPr>
-            <w:lang w:val="en_US" w:bidi="en_US"/>
-          </w:rPr>
-          <w:rPr>
-            <w:color w:val="0000EE"/>
-            <w:u w:val="single"/>
-          </w:rPr>
-          <w:t>Dn 3:26</w:t>
-        </w:r>
-      </w:hyperlink>
+      <w:r>
+        <w:rPr>
+          <w:lang w:val="en_US" w:bidi="en_US"/>
+        </w:rPr>
+        <w:t>Dn 3:26</w:t>
+      </w:r>
       <w:r>
         <w:rPr>
           <w:lang w:val="en_US" w:bidi="en_US"/>
         </w:rPr>
         <w:t xml:space="preserve"> +, </w:t>
       </w:r>
-      <w:hyperlink r:id="rId39">
-        <w:r>
-          <w:rPr>
-            <w:lang w:val="en_US" w:bidi="en_US"/>
-          </w:rPr>
-          <w:rPr>
-            <w:color w:val="0000EE"/>
-            <w:u w:val="single"/>
-          </w:rPr>
-          <w:t>7:15</w:t>
-        </w:r>
-      </w:hyperlink>
+      <w:r>
+        <w:rPr>
+          <w:lang w:val="en_US" w:bidi="en_US"/>
+        </w:rPr>
+        <w:t>7:15</w:t>
+      </w:r>
       <w:r>
         <w:rPr>
           <w:lang w:val="en_US" w:bidi="en_US"/>
@@ -2400,18 +2208,12 @@
         </w:rPr>
         <w:t xml:space="preserve">, v. on </w:t>
       </w:r>
-      <w:hyperlink r:id="rId40">
-        <w:r>
-          <w:rPr>
-            <w:lang w:val="en_US" w:bidi="en_US"/>
-          </w:rPr>
-          <w:rPr>
-            <w:color w:val="0000EE"/>
-            <w:u w:val="single"/>
-          </w:rPr>
-          <w:t>3:6</w:t>
-        </w:r>
-      </w:hyperlink>
+      <w:r>
+        <w:rPr>
+          <w:lang w:val="en_US" w:bidi="en_US"/>
+        </w:rPr>
+        <w:t>3:6</w:t>
+      </w:r>
       <w:r>
         <w:rPr>
           <w:lang w:val="en_US" w:bidi="en_US"/>
@@ -2430,18 +2232,12 @@
         </w:rPr>
         <w:t xml:space="preserve"> † </w:t>
       </w:r>
-      <w:hyperlink r:id="rId41">
-        <w:r>
-          <w:rPr>
-            <w:lang w:val="en_US" w:bidi="en_US"/>
-          </w:rPr>
-          <w:rPr>
-            <w:color w:val="0000EE"/>
-            <w:u w:val="single"/>
-          </w:rPr>
-          <w:t>Ezr 5:7</w:t>
-        </w:r>
-      </w:hyperlink>
+      <w:r>
+        <w:rPr>
+          <w:lang w:val="en_US" w:bidi="en_US"/>
+        </w:rPr>
+        <w:t>Ezr 5:7</w:t>
+      </w:r>
       <w:r>
         <w:rPr>
           <w:lang w:val="en_US" w:bidi="en_US"/>
@@ -2460,36 +2256,24 @@
         </w:rPr>
         <w:t xml:space="preserve"> † </w:t>
       </w:r>
-      <w:hyperlink r:id="rId42">
-        <w:r>
-          <w:rPr>
-            <w:lang w:val="en_US" w:bidi="en_US"/>
-          </w:rPr>
-          <w:rPr>
-            <w:color w:val="0000EE"/>
-            <w:u w:val="single"/>
-          </w:rPr>
-          <w:t>4:15</w:t>
-        </w:r>
-      </w:hyperlink>
+      <w:r>
+        <w:rPr>
+          <w:lang w:val="en_US" w:bidi="en_US"/>
+        </w:rPr>
+        <w:t>4:15</w:t>
+      </w:r>
       <w:r>
         <w:rPr>
           <w:lang w:val="en_US" w:bidi="en_US"/>
         </w:rPr>
         <w:t xml:space="preserve">, </w:t>
       </w:r>
-      <w:hyperlink r:id="rId43">
-        <w:r>
-          <w:rPr>
-            <w:lang w:val="en_US" w:bidi="en_US"/>
-          </w:rPr>
-          <w:rPr>
-            <w:color w:val="0000EE"/>
-            <w:u w:val="single"/>
-          </w:rPr>
-          <w:t>6:2</w:t>
-        </w:r>
-      </w:hyperlink>
+      <w:r>
+        <w:rPr>
+          <w:lang w:val="en_US" w:bidi="en_US"/>
+        </w:rPr>
+        <w:t>6:2</w:t>
+      </w:r>
       <w:r>
         <w:rPr>
           <w:lang w:val="en_US" w:bidi="en_US"/>
@@ -2558,18 +2342,12 @@
         </w:rPr>
         <w:t xml:space="preserve">), </w:t>
       </w:r>
-      <w:hyperlink r:id="rId26">
-        <w:r>
-          <w:rPr>
-            <w:lang w:val="en_US" w:bidi="en_US"/>
-          </w:rPr>
-          <w:rPr>
-            <w:color w:val="0000EE"/>
-            <w:u w:val="single"/>
-          </w:rPr>
-          <w:t>Dn 3:25</w:t>
-        </w:r>
-      </w:hyperlink>
+      <w:r>
+        <w:rPr>
+          <w:lang w:val="en_US" w:bidi="en_US"/>
+        </w:rPr>
+        <w:t>Dn 3:25</w:t>
+      </w:r>
       <w:r>
         <w:rPr>
           <w:lang w:val="en_US" w:bidi="en_US"/>
@@ -2588,72 +2366,48 @@
         </w:rPr>
         <w:t xml:space="preserve">, </w:t>
       </w:r>
-      <w:hyperlink r:id="rId44">
-        <w:r>
-          <w:rPr>
-            <w:lang w:val="en_US" w:bidi="en_US"/>
-          </w:rPr>
-          <w:rPr>
-            <w:color w:val="0000EE"/>
-            <w:u w:val="single"/>
-          </w:rPr>
-          <w:t>4:7</w:t>
-        </w:r>
-      </w:hyperlink>
+      <w:r>
+        <w:rPr>
+          <w:lang w:val="en_US" w:bidi="en_US"/>
+        </w:rPr>
+        <w:t>4:7</w:t>
+      </w:r>
       <w:r>
         <w:rPr>
           <w:lang w:val="en_US" w:bidi="en_US"/>
         </w:rPr>
         <w:t xml:space="preserve">, </w:t>
       </w:r>
-      <w:hyperlink r:id="rId39">
-        <w:r>
-          <w:rPr>
-            <w:lang w:val="en_US" w:bidi="en_US"/>
-          </w:rPr>
-          <w:rPr>
-            <w:color w:val="0000EE"/>
-            <w:u w:val="single"/>
-          </w:rPr>
-          <w:t>7:15</w:t>
-        </w:r>
-      </w:hyperlink>
+      <w:r>
+        <w:rPr>
+          <w:lang w:val="en_US" w:bidi="en_US"/>
+        </w:rPr>
+        <w:t>7:15</w:t>
+      </w:r>
       <w:r>
         <w:rPr>
           <w:lang w:val="en_US" w:bidi="en_US"/>
         </w:rPr>
         <w:t xml:space="preserve">, </w:t>
       </w:r>
-      <w:hyperlink r:id="rId42">
-        <w:r>
-          <w:rPr>
-            <w:lang w:val="en_US" w:bidi="en_US"/>
-          </w:rPr>
-          <w:rPr>
-            <w:color w:val="0000EE"/>
-            <w:u w:val="single"/>
-          </w:rPr>
-          <w:t>Ezr 4:15</w:t>
-        </w:r>
-      </w:hyperlink>
+      <w:r>
+        <w:rPr>
+          <w:lang w:val="en_US" w:bidi="en_US"/>
+        </w:rPr>
+        <w:t>Ezr 4:15</w:t>
+      </w:r>
       <w:r>
         <w:rPr>
           <w:lang w:val="en_US" w:bidi="en_US"/>
         </w:rPr>
         <w:t xml:space="preserve">; </w:t>
       </w:r>
-      <w:hyperlink r:id="rId41">
-        <w:r>
-          <w:rPr>
-            <w:lang w:val="en_US" w:bidi="en_US"/>
-          </w:rPr>
-          <w:rPr>
-            <w:color w:val="0000EE"/>
-            <w:u w:val="single"/>
-          </w:rPr>
-          <w:t>5:7</w:t>
-        </w:r>
-      </w:hyperlink>
+      <w:r>
+        <w:rPr>
+          <w:lang w:val="en_US" w:bidi="en_US"/>
+        </w:rPr>
+        <w:t>5:7</w:t>
+      </w:r>
       <w:r>
         <w:rPr>
           <w:lang w:val="en_US" w:bidi="en_US"/>
@@ -2672,18 +2426,12 @@
         </w:rPr>
         <w:t xml:space="preserve">, </w:t>
       </w:r>
-      <w:hyperlink r:id="rId43">
-        <w:r>
-          <w:rPr>
-            <w:lang w:val="en_US" w:bidi="en_US"/>
-          </w:rPr>
-          <w:rPr>
-            <w:color w:val="0000EE"/>
-            <w:u w:val="single"/>
-          </w:rPr>
-          <w:t>6:2</w:t>
-        </w:r>
-      </w:hyperlink>
+      <w:r>
+        <w:rPr>
+          <w:lang w:val="en_US" w:bidi="en_US"/>
+        </w:rPr>
+        <w:t>6:2</w:t>
+      </w:r>
       <w:r>
         <w:rPr>
           <w:lang w:val="en_US" w:bidi="en_US"/>
@@ -2715,108 +2463,72 @@
         </w:rPr>
         <w:t xml:space="preserve"> </w:t>
       </w:r>
-      <w:hyperlink r:id="rId40">
-        <w:r>
-          <w:rPr>
-            <w:lang w:val="en_US" w:bidi="en_US"/>
-          </w:rPr>
-          <w:rPr>
-            <w:color w:val="0000EE"/>
-            <w:u w:val="single"/>
-          </w:rPr>
-          <w:t>Dn 3:6</w:t>
-        </w:r>
-      </w:hyperlink>
+      <w:r>
+        <w:rPr>
+          <w:lang w:val="en_US" w:bidi="en_US"/>
+        </w:rPr>
+        <w:t>Dn 3:6</w:t>
+      </w:r>
       <w:r>
         <w:rPr>
           <w:lang w:val="en_US" w:bidi="en_US"/>
         </w:rPr>
         <w:t xml:space="preserve">, </w:t>
       </w:r>
-      <w:hyperlink r:id="rId45">
-        <w:r>
-          <w:rPr>
-            <w:lang w:val="en_US" w:bidi="en_US"/>
-          </w:rPr>
-          <w:rPr>
-            <w:color w:val="0000EE"/>
-            <w:u w:val="single"/>
-          </w:rPr>
-          <w:t>3:11</w:t>
-        </w:r>
-      </w:hyperlink>
+      <w:r>
+        <w:rPr>
+          <w:lang w:val="en_US" w:bidi="en_US"/>
+        </w:rPr>
+        <w:t>3:11</w:t>
+      </w:r>
       <w:r>
         <w:rPr>
           <w:lang w:val="en_US" w:bidi="en_US"/>
         </w:rPr>
         <w:t xml:space="preserve">, </w:t>
       </w:r>
-      <w:hyperlink r:id="rId46">
-        <w:r>
-          <w:rPr>
-            <w:lang w:val="en_US" w:bidi="en_US"/>
-          </w:rPr>
-          <w:rPr>
-            <w:color w:val="0000EE"/>
-            <w:u w:val="single"/>
-          </w:rPr>
-          <w:t>3:15</w:t>
-        </w:r>
-      </w:hyperlink>
+      <w:r>
+        <w:rPr>
+          <w:lang w:val="en_US" w:bidi="en_US"/>
+        </w:rPr>
+        <w:t>3:15</w:t>
+      </w:r>
       <w:r>
         <w:rPr>
           <w:lang w:val="en_US" w:bidi="en_US"/>
         </w:rPr>
         <w:t xml:space="preserve">, </w:t>
       </w:r>
-      <w:hyperlink r:id="rId47">
-        <w:r>
-          <w:rPr>
-            <w:lang w:val="en_US" w:bidi="en_US"/>
-          </w:rPr>
-          <w:rPr>
-            <w:color w:val="0000EE"/>
-            <w:u w:val="single"/>
-          </w:rPr>
-          <w:t>3:21</w:t>
-        </w:r>
-      </w:hyperlink>
+      <w:r>
+        <w:rPr>
+          <w:lang w:val="en_US" w:bidi="en_US"/>
+        </w:rPr>
+        <w:t>3:21</w:t>
+      </w:r>
       <w:r>
         <w:rPr>
           <w:lang w:val="en_US" w:bidi="en_US"/>
         </w:rPr>
         <w:t xml:space="preserve">, </w:t>
       </w:r>
-      <w:hyperlink r:id="rId48">
-        <w:r>
-          <w:rPr>
-            <w:lang w:val="en_US" w:bidi="en_US"/>
-          </w:rPr>
-          <w:rPr>
-            <w:color w:val="0000EE"/>
-            <w:u w:val="single"/>
-          </w:rPr>
-          <w:t>3:23</w:t>
-        </w:r>
-      </w:hyperlink>
+      <w:r>
+        <w:rPr>
+          <w:lang w:val="en_US" w:bidi="en_US"/>
+        </w:rPr>
+        <w:t>3:23</w:t>
+      </w:r>
       <w:r>
         <w:rPr>
           <w:lang w:val="en_US" w:bidi="en_US"/>
         </w:rPr>
         <w:t xml:space="preserve">, </w:t>
       </w:r>
-      <w:hyperlink r:id="rId25">
-        <w:r>
-          <w:rPr>
-            <w:lang w:val="en_US" w:bidi="en_US"/>
-          </w:rPr>
-          <w:rPr>
-            <w:color w:val="0000EE"/>
-            <w:u w:val="single"/>
-          </w:rPr>
-          <w:t>3:24</w:t>
-        </w:r>
-      </w:hyperlink>
+      <w:r>
+        <w:rPr>
+          <w:lang w:val="en_US" w:bidi="en_US"/>
+        </w:rPr>
+        <w:t>3:24</w:t>
+      </w:r>
       <w:r>
         <w:rPr>
           <w:lang w:val="en_US" w:bidi="en_US"/>
@@ -2848,18 +2560,12 @@
         </w:rPr>
         <w:t xml:space="preserve"> </w:t>
       </w:r>
-      <w:hyperlink r:id="rId38">
-        <w:r>
-          <w:rPr>
-            <w:lang w:val="en_US" w:bidi="en_US"/>
-          </w:rPr>
-          <w:rPr>
-            <w:color w:val="0000EE"/>
-            <w:u w:val="single"/>
-          </w:rPr>
-          <w:t>Dn 3:26</w:t>
-        </w:r>
-      </w:hyperlink>
+      <w:r>
+        <w:rPr>
+          <w:lang w:val="en_US" w:bidi="en_US"/>
+        </w:rPr>
+        <w:t>Dn 3:26</w:t>
+      </w:r>
       <w:r>
         <w:rPr>
           <w:lang w:val="en_US" w:bidi="en_US"/>
@@ -3125,18 +2831,12 @@
         </w:rPr>
         <w:t xml:space="preserve"> </w:t>
       </w:r>
-      <w:hyperlink r:id="rId49">
-        <w:r>
-          <w:rPr>
-            <w:lang w:val="en_US" w:bidi="en_US"/>
-          </w:rPr>
-          <w:rPr>
-            <w:color w:val="0000EE"/>
-            <w:u w:val="single"/>
-          </w:rPr>
-          <w:t>Ezr 7:21</w:t>
-        </w:r>
-      </w:hyperlink>
+      <w:r>
+        <w:rPr>
+          <w:lang w:val="en_US" w:bidi="en_US"/>
+        </w:rPr>
+        <w:t>Ezr 7:21</w:t>
+      </w:r>
       <w:r>
         <w:rPr>
           <w:lang w:val="en_US" w:bidi="en_US"/>
@@ -3359,36 +3059,24 @@
         </w:rPr>
         <w:t xml:space="preserve"> (of fate; astrologers or soothsayers) </w:t>
       </w:r>
-      <w:hyperlink r:id="rId50">
-        <w:r>
-          <w:rPr>
-            <w:lang w:val="en_US" w:bidi="en_US"/>
-          </w:rPr>
-          <w:rPr>
-            <w:color w:val="0000EE"/>
-            <w:u w:val="single"/>
-          </w:rPr>
-          <w:t>Dn 2:27</w:t>
-        </w:r>
-      </w:hyperlink>
+      <w:r>
+        <w:rPr>
+          <w:lang w:val="en_US" w:bidi="en_US"/>
+        </w:rPr>
+        <w:t>Dn 2:27</w:t>
+      </w:r>
       <w:r>
         <w:rPr>
           <w:lang w:val="en_US" w:bidi="en_US"/>
         </w:rPr>
         <w:t xml:space="preserve">, </w:t>
       </w:r>
-      <w:hyperlink r:id="rId24">
-        <w:r>
-          <w:rPr>
-            <w:lang w:val="en_US" w:bidi="en_US"/>
-          </w:rPr>
-          <w:rPr>
-            <w:color w:val="0000EE"/>
-            <w:u w:val="single"/>
-          </w:rPr>
-          <w:t>5:11</w:t>
-        </w:r>
-      </w:hyperlink>
+      <w:r>
+        <w:rPr>
+          <w:lang w:val="en_US" w:bidi="en_US"/>
+        </w:rPr>
+        <w:t>5:11</w:t>
+      </w:r>
       <w:r>
         <w:rPr>
           <w:lang w:val="en_US" w:bidi="en_US"/>
@@ -3407,36 +3095,24 @@
         </w:rPr>
         <w:t xml:space="preserve"> </w:t>
       </w:r>
-      <w:hyperlink r:id="rId51">
-        <w:r>
-          <w:rPr>
-            <w:lang w:val="en_US" w:bidi="en_US"/>
-          </w:rPr>
-          <w:rPr>
-            <w:color w:val="0000EE"/>
-            <w:u w:val="single"/>
-          </w:rPr>
-          <w:t>4:4</w:t>
-        </w:r>
-      </w:hyperlink>
+      <w:r>
+        <w:rPr>
+          <w:lang w:val="en_US" w:bidi="en_US"/>
+        </w:rPr>
+        <w:t>4:4</w:t>
+      </w:r>
       <w:r>
         <w:rPr>
           <w:lang w:val="en_US" w:bidi="en_US"/>
         </w:rPr>
         <w:t xml:space="preserve">, </w:t>
       </w:r>
-      <w:hyperlink r:id="rId52">
-        <w:r>
-          <w:rPr>
-            <w:lang w:val="en_US" w:bidi="en_US"/>
-          </w:rPr>
-          <w:rPr>
-            <w:color w:val="0000EE"/>
-            <w:u w:val="single"/>
-          </w:rPr>
-          <w:t>5:7</w:t>
-        </w:r>
-      </w:hyperlink>
+      <w:r>
+        <w:rPr>
+          <w:lang w:val="en_US" w:bidi="en_US"/>
+        </w:rPr>
+        <w:t>5:7</w:t>
+      </w:r>
       <w:r>
         <w:rPr>
           <w:lang w:val="en_US" w:bidi="en_US"/>
@@ -3536,18 +3212,12 @@
         </w:rPr>
         <w:t xml:space="preserve"> </w:t>
       </w:r>
-      <w:hyperlink r:id="rId53">
-        <w:r>
-          <w:rPr>
-            <w:lang w:val="en_US" w:bidi="en_US"/>
-          </w:rPr>
-          <w:rPr>
-            <w:color w:val="0000EE"/>
-            <w:u w:val="single"/>
-          </w:rPr>
-          <w:t>2:34</w:t>
-        </w:r>
-      </w:hyperlink>
+      <w:r>
+        <w:rPr>
+          <w:lang w:val="en_US" w:bidi="en_US"/>
+        </w:rPr>
+        <w:t>2:34</w:t>
+      </w:r>
       <w:r>
         <w:rPr>
           <w:lang w:val="en_US" w:bidi="en_US"/>
@@ -3598,18 +3268,12 @@
         </w:rPr>
         <w:t xml:space="preserve"> § 23, 1; 30, 2) v:</w:t>
       </w:r>
-      <w:hyperlink r:id="rId54">
-        <w:r>
-          <w:rPr>
-            <w:lang w:val="en_US" w:bidi="en_US"/>
-          </w:rPr>
-          <w:rPr>
-            <w:color w:val="0000EE"/>
-            <w:u w:val="single"/>
-          </w:rPr>
-          <w:t>45</w:t>
-        </w:r>
-      </w:hyperlink>
+      <w:r>
+        <w:rPr>
+          <w:lang w:val="en_US" w:bidi="en_US"/>
+        </w:rPr>
+        <w:t>45</w:t>
+      </w:r>
       <w:r>
         <w:rPr>
           <w:lang w:val="en_US" w:bidi="en_US"/>
@@ -3739,36 +3403,24 @@
         </w:rPr>
         <w:t xml:space="preserve"> </w:t>
       </w:r>
-      <w:hyperlink r:id="rId55">
-        <w:r>
-          <w:rPr>
-            <w:lang w:val="en_US" w:bidi="en_US"/>
-          </w:rPr>
-          <w:rPr>
-            <w:color w:val="0000EE"/>
-            <w:u w:val="single"/>
-          </w:rPr>
-          <w:t>Dn 4:14</w:t>
-        </w:r>
-      </w:hyperlink>
+      <w:r>
+        <w:rPr>
+          <w:lang w:val="en_US" w:bidi="en_US"/>
+        </w:rPr>
+        <w:t>Dn 4:14</w:t>
+      </w:r>
       <w:r>
         <w:rPr>
           <w:lang w:val="en_US" w:bidi="en_US"/>
         </w:rPr>
         <w:t xml:space="preserve">, </w:t>
       </w:r>
-      <w:hyperlink r:id="rId56">
-        <w:r>
-          <w:rPr>
-            <w:lang w:val="en_US" w:bidi="en_US"/>
-          </w:rPr>
-          <w:rPr>
-            <w:color w:val="0000EE"/>
-            <w:u w:val="single"/>
-          </w:rPr>
-          <w:t>4:21</w:t>
-        </w:r>
-      </w:hyperlink>
+      <w:r>
+        <w:rPr>
+          <w:lang w:val="en_US" w:bidi="en_US"/>
+        </w:rPr>
+        <w:t>4:21</w:t>
+      </w:r>
       <w:r>
         <w:rPr>
           <w:lang w:val="en_US" w:bidi="en_US"/>
@@ -3921,18 +3573,12 @@
         </w:rPr>
         <w:t xml:space="preserve"> 47:3), read perh. in </w:t>
       </w:r>
-      <w:hyperlink r:id="rId39">
-        <w:r>
-          <w:rPr>
-            <w:lang w:val="en_US" w:bidi="en_US"/>
-          </w:rPr>
-          <w:rPr>
-            <w:color w:val="0000EE"/>
-            <w:u w:val="single"/>
-          </w:rPr>
-          <w:t>7:15</w:t>
-        </w:r>
-      </w:hyperlink>
+      <w:r>
+        <w:rPr>
+          <w:lang w:val="en_US" w:bidi="en_US"/>
+        </w:rPr>
+        <w:t>7:15</w:t>
+      </w:r>
       <w:r>
         <w:rPr>
           <w:lang w:val="en_US" w:bidi="en_US"/>
@@ -4026,18 +3672,12 @@
         </w:rPr>
         <w:t xml:space="preserve"> </w:t>
       </w:r>
-      <w:hyperlink r:id="rId57">
-        <w:r>
-          <w:rPr>
-            <w:lang w:val="en_US" w:bidi="en_US"/>
-          </w:rPr>
-          <w:rPr>
-            <w:color w:val="0000EE"/>
-            <w:u w:val="single"/>
-          </w:rPr>
-          <w:t>Dn 5:5</w:t>
-        </w:r>
-      </w:hyperlink>
+      <w:r>
+        <w:rPr>
+          <w:lang w:val="en_US" w:bidi="en_US"/>
+        </w:rPr>
+        <w:t>Dn 5:5</w:t>
+      </w:r>
       <w:r>
         <w:rPr>
           <w:lang w:val="en_US" w:bidi="en_US"/>
@@ -4292,18 +3932,12 @@
         </w:rPr>
         <w:t xml:space="preserve"> </w:t>
       </w:r>
-      <w:hyperlink r:id="rId58">
-        <w:r>
-          <w:rPr>
-            <w:lang w:val="en_US" w:bidi="en_US"/>
-          </w:rPr>
-          <w:rPr>
-            <w:color w:val="0000EE"/>
-            <w:u w:val="single"/>
-          </w:rPr>
-          <w:t>Dn 2:47</w:t>
-        </w:r>
-      </w:hyperlink>
+      <w:r>
+        <w:rPr>
+          <w:lang w:val="en_US" w:bidi="en_US"/>
+        </w:rPr>
+        <w:t>Dn 2:47</w:t>
+      </w:r>
       <w:r>
         <w:rPr>
           <w:lang w:val="en_US" w:bidi="en_US"/>
@@ -4335,72 +3969,48 @@
         </w:rPr>
         <w:t xml:space="preserve"> v:</w:t>
       </w:r>
-      <w:hyperlink r:id="rId59">
-        <w:r>
-          <w:rPr>
-            <w:lang w:val="en_US" w:bidi="en_US"/>
-          </w:rPr>
-          <w:rPr>
-            <w:color w:val="0000EE"/>
-            <w:u w:val="single"/>
-          </w:rPr>
-          <w:t>22</w:t>
-        </w:r>
-      </w:hyperlink>
+      <w:r>
+        <w:rPr>
+          <w:lang w:val="en_US" w:bidi="en_US"/>
+        </w:rPr>
+        <w:t>22</w:t>
+      </w:r>
       <w:r>
         <w:rPr>
           <w:lang w:val="en_US" w:bidi="en_US"/>
         </w:rPr>
         <w:t>, v:</w:t>
       </w:r>
-      <w:hyperlink r:id="rId60">
-        <w:r>
-          <w:rPr>
-            <w:lang w:val="en_US" w:bidi="en_US"/>
-          </w:rPr>
-          <w:rPr>
-            <w:color w:val="0000EE"/>
-            <w:u w:val="single"/>
-          </w:rPr>
-          <w:t>28</w:t>
-        </w:r>
-      </w:hyperlink>
+      <w:r>
+        <w:rPr>
+          <w:lang w:val="en_US" w:bidi="en_US"/>
+        </w:rPr>
+        <w:t>28</w:t>
+      </w:r>
       <w:r>
         <w:rPr>
           <w:lang w:val="en_US" w:bidi="en_US"/>
         </w:rPr>
         <w:t>, v:</w:t>
       </w:r>
-      <w:hyperlink r:id="rId61">
-        <w:r>
-          <w:rPr>
-            <w:lang w:val="en_US" w:bidi="en_US"/>
-          </w:rPr>
-          <w:rPr>
-            <w:color w:val="0000EE"/>
-            <w:u w:val="single"/>
-          </w:rPr>
-          <w:t>29</w:t>
-        </w:r>
-      </w:hyperlink>
+      <w:r>
+        <w:rPr>
+          <w:lang w:val="en_US" w:bidi="en_US"/>
+        </w:rPr>
+        <w:t>29</w:t>
+      </w:r>
       <w:r>
         <w:rPr>
           <w:lang w:val="en_US" w:bidi="en_US"/>
         </w:rPr>
         <w:t>, v:</w:t>
       </w:r>
-      <w:hyperlink r:id="rId58">
-        <w:r>
-          <w:rPr>
-            <w:lang w:val="en_US" w:bidi="en_US"/>
-          </w:rPr>
-          <w:rPr>
-            <w:color w:val="0000EE"/>
-            <w:u w:val="single"/>
-          </w:rPr>
-          <w:t>47</w:t>
-        </w:r>
-      </w:hyperlink>
+      <w:r>
+        <w:rPr>
+          <w:lang w:val="en_US" w:bidi="en_US"/>
+        </w:rPr>
+        <w:t>47</w:t>
+      </w:r>
       <w:r>
         <w:rPr>
           <w:lang w:val="en_US" w:bidi="en_US"/>
@@ -4445,18 +4055,12 @@
         </w:rPr>
         <w:t xml:space="preserve"> v:</w:t>
       </w:r>
-      <w:hyperlink r:id="rId62">
-        <w:r>
-          <w:rPr>
-            <w:lang w:val="en_US" w:bidi="en_US"/>
-          </w:rPr>
-          <w:rPr>
-            <w:color w:val="0000EE"/>
-            <w:u w:val="single"/>
-          </w:rPr>
-          <w:t>19</w:t>
-        </w:r>
-      </w:hyperlink>
+      <w:r>
+        <w:rPr>
+          <w:lang w:val="en_US" w:bidi="en_US"/>
+        </w:rPr>
+        <w:t>19</w:t>
+      </w:r>
       <w:r>
         <w:rPr>
           <w:lang w:val="en_US" w:bidi="en_US"/>
@@ -4475,18 +4079,12 @@
         </w:rPr>
         <w:t xml:space="preserve"> v:</w:t>
       </w:r>
-      <w:hyperlink r:id="rId63">
-        <w:r>
-          <w:rPr>
-            <w:lang w:val="en_US" w:bidi="en_US"/>
-          </w:rPr>
-          <w:rPr>
-            <w:color w:val="0000EE"/>
-            <w:u w:val="single"/>
-          </w:rPr>
-          <w:t>30</w:t>
-        </w:r>
-      </w:hyperlink>
+      <w:r>
+        <w:rPr>
+          <w:lang w:val="en_US" w:bidi="en_US"/>
+        </w:rPr>
+        <w:t>30</w:t>
+      </w:r>
       <w:r>
         <w:rPr>
           <w:lang w:val="en_US" w:bidi="en_US"/>
@@ -4668,36 +4266,24 @@
         </w:rPr>
         <w:t xml:space="preserve"> </w:t>
       </w:r>
-      <w:hyperlink r:id="rId64">
-        <w:r>
-          <w:rPr>
-            <w:lang w:val="en_US" w:bidi="en_US"/>
-          </w:rPr>
-          <w:rPr>
-            <w:color w:val="0000EE"/>
-            <w:u w:val="single"/>
-          </w:rPr>
-          <w:t>Ezr 4:10</w:t>
-        </w:r>
-      </w:hyperlink>
+      <w:r>
+        <w:rPr>
+          <w:lang w:val="en_US" w:bidi="en_US"/>
+        </w:rPr>
+        <w:t>Ezr 4:10</w:t>
+      </w:r>
       <w:r>
         <w:rPr>
           <w:lang w:val="en_US" w:bidi="en_US"/>
         </w:rPr>
         <w:t xml:space="preserve">, </w:t>
       </w:r>
-      <w:hyperlink r:id="rId65">
-        <w:r>
-          <w:rPr>
-            <w:lang w:val="en_US" w:bidi="en_US"/>
-          </w:rPr>
-          <w:rPr>
-            <w:color w:val="0000EE"/>
-            <w:u w:val="single"/>
-          </w:rPr>
-          <w:t>5:12</w:t>
-        </w:r>
-      </w:hyperlink>
+      <w:r>
+        <w:rPr>
+          <w:lang w:val="en_US" w:bidi="en_US"/>
+        </w:rPr>
+        <w:t>5:12</w:t>
+      </w:r>
       <w:r>
         <w:rPr>
           <w:lang w:val="en_US" w:bidi="en_US"/>
@@ -4822,72 +4408,48 @@
         </w:rPr>
         <w:t xml:space="preserve"> i.e. exiles, </w:t>
       </w:r>
-      <w:hyperlink r:id="rId66">
-        <w:r>
-          <w:rPr>
-            <w:lang w:val="en_US" w:bidi="en_US"/>
-          </w:rPr>
-          <w:rPr>
-            <w:color w:val="0000EE"/>
-            <w:u w:val="single"/>
-          </w:rPr>
-          <w:t>Ezr 6:16</w:t>
-        </w:r>
-      </w:hyperlink>
+      <w:r>
+        <w:rPr>
+          <w:lang w:val="en_US" w:bidi="en_US"/>
+        </w:rPr>
+        <w:t>Ezr 6:16</w:t>
+      </w:r>
       <w:r>
         <w:rPr>
           <w:lang w:val="en_US" w:bidi="en_US"/>
         </w:rPr>
         <w:t xml:space="preserve">, </w:t>
       </w:r>
-      <w:hyperlink r:id="rId23">
-        <w:r>
-          <w:rPr>
-            <w:lang w:val="en_US" w:bidi="en_US"/>
-          </w:rPr>
-          <w:rPr>
-            <w:color w:val="0000EE"/>
-            <w:u w:val="single"/>
-          </w:rPr>
-          <w:t>Dn 2:25</w:t>
-        </w:r>
-      </w:hyperlink>
+      <w:r>
+        <w:rPr>
+          <w:lang w:val="en_US" w:bidi="en_US"/>
+        </w:rPr>
+        <w:t>Dn 2:25</w:t>
+      </w:r>
       <w:r>
         <w:rPr>
           <w:lang w:val="en_US" w:bidi="en_US"/>
         </w:rPr>
         <w:t xml:space="preserve">, </w:t>
       </w:r>
-      <w:hyperlink r:id="rId67">
-        <w:r>
-          <w:rPr>
-            <w:lang w:val="en_US" w:bidi="en_US"/>
-          </w:rPr>
-          <w:rPr>
-            <w:color w:val="0000EE"/>
-            <w:u w:val="single"/>
-          </w:rPr>
-          <w:t>5:13</w:t>
-        </w:r>
-      </w:hyperlink>
+      <w:r>
+        <w:rPr>
+          <w:lang w:val="en_US" w:bidi="en_US"/>
+        </w:rPr>
+        <w:t>5:13</w:t>
+      </w:r>
       <w:r>
         <w:rPr>
           <w:lang w:val="en_US" w:bidi="en_US"/>
         </w:rPr>
         <w:t xml:space="preserve">, </w:t>
       </w:r>
-      <w:hyperlink r:id="rId68">
-        <w:r>
-          <w:rPr>
-            <w:lang w:val="en_US" w:bidi="en_US"/>
-          </w:rPr>
-          <w:rPr>
-            <w:color w:val="0000EE"/>
-            <w:u w:val="single"/>
-          </w:rPr>
-          <w:t>6:14</w:t>
-        </w:r>
-      </w:hyperlink>
+      <w:r>
+        <w:rPr>
+          <w:lang w:val="en_US" w:bidi="en_US"/>
+        </w:rPr>
+        <w:t>6:14</w:t>
+      </w:r>
       <w:r>
         <w:rPr>
           <w:lang w:val="en_US" w:bidi="en_US"/>
@@ -5152,36 +4714,24 @@
         </w:rPr>
         <w:t xml:space="preserve">: </w:t>
       </w:r>
-      <w:hyperlink r:id="rId69">
-        <w:r>
-          <w:rPr>
-            <w:lang w:val="en_US" w:bidi="en_US"/>
-          </w:rPr>
-          <w:rPr>
-            <w:color w:val="0000EE"/>
-            <w:u w:val="single"/>
-          </w:rPr>
-          <w:t>Ezr 5:8</w:t>
-        </w:r>
-      </w:hyperlink>
+      <w:r>
+        <w:rPr>
+          <w:lang w:val="en_US" w:bidi="en_US"/>
+        </w:rPr>
+        <w:t>Ezr 5:8</w:t>
+      </w:r>
       <w:r>
         <w:rPr>
           <w:lang w:val="en_US" w:bidi="en_US"/>
         </w:rPr>
         <w:t xml:space="preserve">, </w:t>
       </w:r>
-      <w:hyperlink r:id="rId70">
-        <w:r>
-          <w:rPr>
-            <w:lang w:val="en_US" w:bidi="en_US"/>
-          </w:rPr>
-          <w:rPr>
-            <w:color w:val="0000EE"/>
-            <w:u w:val="single"/>
-          </w:rPr>
-          <w:t>6:4</w:t>
-        </w:r>
-      </w:hyperlink>
+      <w:r>
+        <w:rPr>
+          <w:lang w:val="en_US" w:bidi="en_US"/>
+        </w:rPr>
+        <w:t>6:4</w:t>
+      </w:r>
       <w:r>
         <w:rPr>
           <w:lang w:val="en_US" w:bidi="en_US"/>
@@ -5300,18 +4850,12 @@
         </w:rPr>
         <w:t xml:space="preserve"> </w:t>
       </w:r>
-      <w:hyperlink r:id="rId71">
-        <w:r>
-          <w:rPr>
-            <w:lang w:val="en_US" w:bidi="en_US"/>
-          </w:rPr>
-          <w:rPr>
-            <w:color w:val="0000EE"/>
-            <w:u w:val="single"/>
-          </w:rPr>
-          <w:t>Dn 7:9</w:t>
-        </w:r>
-      </w:hyperlink>
+      <w:r>
+        <w:rPr>
+          <w:lang w:val="en_US" w:bidi="en_US"/>
+        </w:rPr>
+        <w:t>Dn 7:9</w:t>
+      </w:r>
       <w:r>
         <w:rPr>
           <w:lang w:val="en_US" w:bidi="en_US"/>
@@ -5381,18 +4925,12 @@
         </w:rPr>
         <w:t xml:space="preserve"> (book-) roll (Targum BH);—</w:t>
       </w:r>
-      <w:hyperlink r:id="rId43">
-        <w:r>
-          <w:rPr>
-            <w:lang w:val="en_US" w:bidi="en_US"/>
-          </w:rPr>
-          <w:rPr>
-            <w:color w:val="0000EE"/>
-            <w:u w:val="single"/>
-          </w:rPr>
-          <w:t>Ezr 6:2</w:t>
-        </w:r>
-      </w:hyperlink>
+      <w:r>
+        <w:rPr>
+          <w:lang w:val="en_US" w:bidi="en_US"/>
+        </w:rPr>
+        <w:t>Ezr 6:2</w:t>
+      </w:r>
       <w:r>
         <w:rPr>
           <w:lang w:val="en_US" w:bidi="en_US"/>
@@ -5554,18 +5092,12 @@
         </w:rPr>
         <w:t xml:space="preserve"> </w:t>
       </w:r>
-      <w:hyperlink r:id="rId72">
-        <w:r>
-          <w:rPr>
-            <w:lang w:val="en_US" w:bidi="en_US"/>
-          </w:rPr>
-          <w:rPr>
-            <w:color w:val="0000EE"/>
-            <w:u w:val="single"/>
-          </w:rPr>
-          <w:t>Ezr 7:12</w:t>
-        </w:r>
-      </w:hyperlink>
+      <w:r>
+        <w:rPr>
+          <w:lang w:val="en_US" w:bidi="en_US"/>
+        </w:rPr>
+        <w:t>Ezr 7:12</w:t>
+      </w:r>
       <w:r>
         <w:rPr>
           <w:lang w:val="en_US" w:bidi="en_US"/>
@@ -5609,18 +5141,12 @@
         </w:rPr>
         <w:t xml:space="preserve">; cf. </w:t>
       </w:r>
-      <w:hyperlink r:id="rId41">
-        <w:r>
-          <w:rPr>
-            <w:lang w:val="en_US" w:bidi="en_US"/>
-          </w:rPr>
-          <w:rPr>
-            <w:color w:val="0000EE"/>
-            <w:u w:val="single"/>
-          </w:rPr>
-          <w:t>5:7</w:t>
-        </w:r>
-      </w:hyperlink>
+      <w:r>
+        <w:rPr>
+          <w:lang w:val="en_US" w:bidi="en_US"/>
+        </w:rPr>
+        <w:t>5:7</w:t>
+      </w:r>
       <w:r>
         <w:rPr>
           <w:lang w:val="en_US" w:bidi="en_US"/>
@@ -5690,18 +5216,12 @@
         </w:rPr>
         <w:t>:</w:t>
       </w:r>
-      <w:hyperlink r:id="rId73">
-        <w:r>
-          <w:rPr>
-            <w:lang w:val="en_US" w:bidi="en_US"/>
-          </w:rPr>
-          <w:rPr>
-            <w:color w:val="0000EE"/>
-            <w:u w:val="single"/>
-          </w:rPr>
-          <w:t>Ezr 6:1</w:t>
-        </w:r>
-      </w:hyperlink>
+      <w:r>
+        <w:rPr>
+          <w:lang w:val="en_US" w:bidi="en_US"/>
+        </w:rPr>
+        <w:t>Ezr 6:1</w:t>
+      </w:r>
       <w:r>
         <w:rPr>
           <w:lang w:val="en_US" w:bidi="en_US"/>
@@ -5769,18 +5289,12 @@
         </w:rPr>
         <w:t xml:space="preserve"> </w:t>
       </w:r>
-      <w:hyperlink r:id="rId73">
-        <w:r>
-          <w:rPr>
-            <w:lang w:val="en_US" w:bidi="en_US"/>
-          </w:rPr>
-          <w:rPr>
-            <w:color w:val="0000EE"/>
-            <w:u w:val="single"/>
-          </w:rPr>
-          <w:t>Ezr 6:1</w:t>
-        </w:r>
-      </w:hyperlink>
+      <w:r>
+        <w:rPr>
+          <w:lang w:val="en_US" w:bidi="en_US"/>
+        </w:rPr>
+        <w:t>Ezr 6:1</w:t>
+      </w:r>
       <w:r>
         <w:rPr>
           <w:lang w:val="en_US" w:bidi="en_US"/>
@@ -5811,18 +5325,12 @@
         </w:rPr>
         <w:t xml:space="preserve">: </w:t>
       </w:r>
-      <w:hyperlink r:id="rId74">
-        <w:r>
-          <w:rPr>
-            <w:lang w:val="en_US" w:bidi="en_US"/>
-          </w:rPr>
-          <w:rPr>
-            <w:color w:val="0000EE"/>
-            <w:u w:val="single"/>
-          </w:rPr>
-          <w:t>5:17</w:t>
-        </w:r>
-      </w:hyperlink>
+      <w:r>
+        <w:rPr>
+          <w:lang w:val="en_US" w:bidi="en_US"/>
+        </w:rPr>
+        <w:t>5:17</w:t>
+      </w:r>
       <w:r>
         <w:rPr>
           <w:lang w:val="en_US" w:bidi="en_US"/>
@@ -5841,18 +5349,12 @@
         </w:rPr>
         <w:t xml:space="preserve"> </w:t>
       </w:r>
-      <w:hyperlink r:id="rId75">
-        <w:r>
-          <w:rPr>
-            <w:lang w:val="en_US" w:bidi="en_US"/>
-          </w:rPr>
-          <w:rPr>
-            <w:color w:val="0000EE"/>
-            <w:u w:val="single"/>
-          </w:rPr>
-          <w:t>7:20</w:t>
-        </w:r>
-      </w:hyperlink>
+      <w:r>
+        <w:rPr>
+          <w:lang w:val="en_US" w:bidi="en_US"/>
+        </w:rPr>
+        <w:t>7:20</w:t>
+      </w:r>
       <w:r>
         <w:rPr>
           <w:lang w:val="en_US" w:bidi="en_US"/>
@@ -5922,18 +5424,12 @@
         </w:rPr>
         <w:t xml:space="preserve">: </w:t>
       </w:r>
-      <w:hyperlink r:id="rId76">
-        <w:r>
-          <w:rPr>
-            <w:lang w:val="en_US" w:bidi="en_US"/>
-          </w:rPr>
-          <w:rPr>
-            <w:color w:val="0000EE"/>
-            <w:u w:val="single"/>
-          </w:rPr>
-          <w:t>Dn 7:4</w:t>
-        </w:r>
-      </w:hyperlink>
+      <w:r>
+        <w:rPr>
+          <w:lang w:val="en_US" w:bidi="en_US"/>
+        </w:rPr>
+        <w:t>Dn 7:4</w:t>
+      </w:r>
       <w:r>
         <w:rPr>
           <w:lang w:val="en_US" w:bidi="en_US"/>
@@ -6229,36 +5725,24 @@
         </w:rPr>
         <w:t xml:space="preserve"> </w:t>
       </w:r>
-      <w:hyperlink r:id="rId76">
-        <w:r>
-          <w:rPr>
-            <w:lang w:val="en_US" w:bidi="en_US"/>
-          </w:rPr>
-          <w:rPr>
-            <w:color w:val="0000EE"/>
-            <w:u w:val="single"/>
-          </w:rPr>
-          <w:t>Dn 7:4</w:t>
-        </w:r>
-      </w:hyperlink>
+      <w:r>
+        <w:rPr>
+          <w:lang w:val="en_US" w:bidi="en_US"/>
+        </w:rPr>
+        <w:t>Dn 7:4</w:t>
+      </w:r>
       <w:r>
         <w:rPr>
           <w:lang w:val="en_US" w:bidi="en_US"/>
         </w:rPr>
         <w:t xml:space="preserve">, </w:t>
       </w:r>
-      <w:hyperlink r:id="rId14">
-        <w:r>
-          <w:rPr>
-            <w:lang w:val="en_US" w:bidi="en_US"/>
-          </w:rPr>
-          <w:rPr>
-            <w:color w:val="0000EE"/>
-            <w:u w:val="single"/>
-          </w:rPr>
-          <w:t>7:6</w:t>
-        </w:r>
-      </w:hyperlink>
+      <w:r>
+        <w:rPr>
+          <w:lang w:val="en_US" w:bidi="en_US"/>
+        </w:rPr>
+        <w:t>7:6</w:t>
+      </w:r>
       <w:r>
         <w:rPr>
           <w:lang w:val="en_US" w:bidi="en_US"/>
@@ -6277,18 +5761,12 @@
         </w:rPr>
         <w:t xml:space="preserve"> v:</w:t>
       </w:r>
-      <w:hyperlink r:id="rId76">
-        <w:r>
-          <w:rPr>
-            <w:lang w:val="en_US" w:bidi="en_US"/>
-          </w:rPr>
-          <w:rPr>
-            <w:color w:val="0000EE"/>
-            <w:u w:val="single"/>
-          </w:rPr>
-          <w:t>4</w:t>
-        </w:r>
-      </w:hyperlink>
+      <w:r>
+        <w:rPr>
+          <w:lang w:val="en_US" w:bidi="en_US"/>
+        </w:rPr>
+        <w:t>4</w:t>
+      </w:r>
       <w:r>
         <w:rPr>
           <w:lang w:val="en_US" w:bidi="en_US"/>
@@ -6473,18 +5951,12 @@
         </w:rPr>
         <w:t xml:space="preserve"> </w:t>
       </w:r>
-      <w:hyperlink r:id="rId16">
-        <w:r>
-          <w:rPr>
-            <w:lang w:val="en_US" w:bidi="en_US"/>
-          </w:rPr>
-          <w:rPr>
-            <w:color w:val="0000EE"/>
-            <w:u w:val="single"/>
-          </w:rPr>
-          <w:t>Dn 6:25</w:t>
-        </w:r>
-      </w:hyperlink>
+      <w:r>
+        <w:rPr>
+          <w:lang w:val="en_US" w:bidi="en_US"/>
+        </w:rPr>
+        <w:t>Dn 6:25</w:t>
+      </w:r>
       <w:r>
         <w:rPr>
           <w:lang w:val="en_US" w:bidi="en_US"/>
@@ -6554,18 +6026,12 @@
         </w:rPr>
         <w:t>:</w:t>
       </w:r>
-      <w:hyperlink r:id="rId77">
-        <w:r>
-          <w:rPr>
-            <w:lang w:val="en_US" w:bidi="en_US"/>
-          </w:rPr>
-          <w:rPr>
-            <w:color w:val="0000EE"/>
-            <w:u w:val="single"/>
-          </w:rPr>
-          <w:t>Dn 4:30</w:t>
-        </w:r>
-      </w:hyperlink>
+      <w:r>
+        <w:rPr>
+          <w:lang w:val="en_US" w:bidi="en_US"/>
+        </w:rPr>
+        <w:t>Dn 4:30</w:t>
+      </w:r>
       <w:r>
         <w:rPr>
           <w:lang w:val="en_US" w:bidi="en_US"/>
@@ -6690,36 +6156,24 @@
         </w:rPr>
         <w:t xml:space="preserve"> </w:t>
       </w:r>
-      <w:hyperlink r:id="rId77">
-        <w:r>
-          <w:rPr>
-            <w:lang w:val="en_US" w:bidi="en_US"/>
-          </w:rPr>
-          <w:rPr>
-            <w:color w:val="0000EE"/>
-            <w:u w:val="single"/>
-          </w:rPr>
-          <w:t>Dn 4:30</w:t>
-        </w:r>
-      </w:hyperlink>
+      <w:r>
+        <w:rPr>
+          <w:lang w:val="en_US" w:bidi="en_US"/>
+        </w:rPr>
+        <w:t>Dn 4:30</w:t>
+      </w:r>
       <w:r>
         <w:rPr>
           <w:lang w:val="en_US" w:bidi="en_US"/>
         </w:rPr>
         <w:t xml:space="preserve">, </w:t>
       </w:r>
-      <w:hyperlink r:id="rId78">
-        <w:r>
-          <w:rPr>
-            <w:lang w:val="en_US" w:bidi="en_US"/>
-          </w:rPr>
-          <w:rPr>
-            <w:color w:val="0000EE"/>
-            <w:u w:val="single"/>
-          </w:rPr>
-          <w:t>5:21</w:t>
-        </w:r>
-      </w:hyperlink>
+      <w:r>
+        <w:rPr>
+          <w:lang w:val="en_US" w:bidi="en_US"/>
+        </w:rPr>
+        <w:t>5:21</w:t>
+      </w:r>
       <w:r>
         <w:rPr>
           <w:lang w:val="en_US" w:bidi="en_US"/>
@@ -6769,36 +6223,24 @@
         </w:rPr>
         <w:t xml:space="preserve"> 15 a) </w:t>
       </w:r>
-      <w:hyperlink r:id="rId79">
-        <w:r>
-          <w:rPr>
-            <w:lang w:val="en_US" w:bidi="en_US"/>
-          </w:rPr>
-          <w:rPr>
-            <w:color w:val="0000EE"/>
-            <w:u w:val="single"/>
-          </w:rPr>
-          <w:t>3:27</w:t>
-        </w:r>
-      </w:hyperlink>
+      <w:r>
+        <w:rPr>
+          <w:lang w:val="en_US" w:bidi="en_US"/>
+        </w:rPr>
+        <w:t>3:27</w:t>
+      </w:r>
       <w:r>
         <w:rPr>
           <w:lang w:val="en_US" w:bidi="en_US"/>
         </w:rPr>
         <w:t xml:space="preserve">, </w:t>
       </w:r>
-      <w:hyperlink r:id="rId80">
-        <w:r>
-          <w:rPr>
-            <w:lang w:val="en_US" w:bidi="en_US"/>
-          </w:rPr>
-          <w:rPr>
-            <w:color w:val="0000EE"/>
-            <w:u w:val="single"/>
-          </w:rPr>
-          <w:t>3:28</w:t>
-        </w:r>
-      </w:hyperlink>
+      <w:r>
+        <w:rPr>
+          <w:lang w:val="en_US" w:bidi="en_US"/>
+        </w:rPr>
+        <w:t>3:28</w:t>
+      </w:r>
       <w:r>
         <w:rPr>
           <w:lang w:val="en_US" w:bidi="en_US"/>

</xml_diff>